<commit_message>
version stable avec systheme toujours fonctionnel meme apres deco
</commit_message>
<xml_diff>
--- a/documentations/rapport.docx
+++ b/documentations/rapport.docx
@@ -13,19 +13,7 @@
         <w:rPr>
           <w:shd w:fill="auto" w:val="clear"/>
         </w:rPr>
-        <w:t>UNIVERSITÉ DU [</w:t>
-      </w:r>
-      <w:r>
-        <w:rPr>
-          <w:shd w:fill="auto" w:val="clear"/>
-        </w:rPr>
-        <w:t>LIEU</w:t>
-      </w:r>
-      <w:r>
-        <w:rPr>
-          <w:shd w:fill="auto" w:val="clear"/>
-        </w:rPr>
-        <w:t>]</w:t>
+        <w:t>UNIVERSITÉ DU [LIEU]</w:t>
       </w:r>
     </w:p>
     <w:p>
@@ -105,8 +93,149 @@
         <w:rPr>
           <w:shd w:fill="auto" w:val="clear"/>
         </w:rPr>
-        <w:t xml:space="preserve">PRÉSENTÉ À </w:t>
-      </w:r>
+        <w:t>PRÉSENTÉ À [NOM]</w:t>
+      </w:r>
+    </w:p>
+    <w:p>
+      <w:pPr>
+        <w:pStyle w:val="Premirepage"/>
+        <w:rPr>
+          <w:shd w:fill="auto" w:val="clear"/>
+        </w:rPr>
+      </w:pPr>
+      <w:r>
+        <w:rPr>
+          <w:shd w:fill="auto" w:val="clear"/>
+        </w:rPr>
+      </w:r>
+    </w:p>
+    <w:p>
+      <w:pPr>
+        <w:pStyle w:val="Premirepage"/>
+        <w:rPr>
+          <w:shd w:fill="auto" w:val="clear"/>
+        </w:rPr>
+      </w:pPr>
+      <w:r>
+        <w:rPr>
+          <w:shd w:fill="auto" w:val="clear"/>
+        </w:rPr>
+      </w:r>
+    </w:p>
+    <w:p>
+      <w:pPr>
+        <w:pStyle w:val="Premirepage"/>
+        <w:rPr>
+          <w:shd w:fill="auto" w:val="clear"/>
+        </w:rPr>
+      </w:pPr>
+      <w:r>
+        <w:rPr>
+          <w:shd w:fill="auto" w:val="clear"/>
+        </w:rPr>
+      </w:r>
+    </w:p>
+    <w:p>
+      <w:pPr>
+        <w:pStyle w:val="Premirepage"/>
+        <w:rPr>
+          <w:shd w:fill="auto" w:val="clear"/>
+        </w:rPr>
+      </w:pPr>
+      <w:r>
+        <w:rPr>
+          <w:shd w:fill="auto" w:val="clear"/>
+        </w:rPr>
+      </w:r>
+    </w:p>
+    <w:p>
+      <w:pPr>
+        <w:pStyle w:val="Premirepage"/>
+        <w:rPr>
+          <w:shd w:fill="auto" w:val="clear"/>
+        </w:rPr>
+      </w:pPr>
+      <w:r>
+        <w:rPr>
+          <w:shd w:fill="auto" w:val="clear"/>
+        </w:rPr>
+        <w:t>COMME EXIGENCE DU COURS</w:t>
+      </w:r>
+    </w:p>
+    <w:p>
+      <w:pPr>
+        <w:pStyle w:val="Premirepage"/>
+        <w:rPr>
+          <w:shd w:fill="auto" w:val="clear"/>
+        </w:rPr>
+      </w:pPr>
+      <w:r>
+        <w:rPr>
+          <w:shd w:fill="auto" w:val="clear"/>
+        </w:rPr>
+        <w:t>[COURS]</w:t>
+      </w:r>
+    </w:p>
+    <w:p>
+      <w:pPr>
+        <w:pStyle w:val="Premirepage"/>
+        <w:rPr>
+          <w:shd w:fill="auto" w:val="clear"/>
+        </w:rPr>
+      </w:pPr>
+      <w:r>
+        <w:rPr>
+          <w:shd w:fill="auto" w:val="clear"/>
+        </w:rPr>
+      </w:r>
+    </w:p>
+    <w:p>
+      <w:pPr>
+        <w:pStyle w:val="Premirepage"/>
+        <w:rPr>
+          <w:shd w:fill="auto" w:val="clear"/>
+        </w:rPr>
+      </w:pPr>
+      <w:r>
+        <w:rPr>
+          <w:shd w:fill="auto" w:val="clear"/>
+        </w:rPr>
+      </w:r>
+    </w:p>
+    <w:p>
+      <w:pPr>
+        <w:pStyle w:val="Premirepage"/>
+        <w:rPr>
+          <w:shd w:fill="auto" w:val="clear"/>
+        </w:rPr>
+      </w:pPr>
+      <w:r>
+        <w:rPr>
+          <w:shd w:fill="auto" w:val="clear"/>
+        </w:rPr>
+      </w:r>
+    </w:p>
+    <w:p>
+      <w:pPr>
+        <w:pStyle w:val="Premirepage"/>
+        <w:rPr>
+          <w:shd w:fill="auto" w:val="clear"/>
+        </w:rPr>
+      </w:pPr>
+      <w:r>
+        <w:rPr>
+          <w:shd w:fill="auto" w:val="clear"/>
+        </w:rPr>
+        <w:t xml:space="preserve">PAR </w:t>
+      </w:r>
+    </w:p>
+    <w:p>
+      <w:pPr>
+        <w:pStyle w:val="Premirepage"/>
+        <w:rPr>
+          <w:shd w:fill="auto" w:val="clear"/>
+        </w:rPr>
+      </w:pPr>
       <w:r>
         <w:rPr>
           <w:shd w:fill="auto" w:val="clear"/>
@@ -177,7 +306,6 @@
         <w:rPr>
           <w:shd w:fill="auto" w:val="clear"/>
         </w:rPr>
-        <w:t>COMME EXIGENCE DU COURS</w:t>
       </w:r>
     </w:p>
     <w:p>
@@ -191,165 +319,7 @@
         <w:rPr>
           <w:shd w:fill="auto" w:val="clear"/>
         </w:rPr>
-        <w:t>[COURS]</w:t>
-      </w:r>
-    </w:p>
-    <w:p>
-      <w:pPr>
-        <w:pStyle w:val="Premirepage"/>
-        <w:rPr>
-          <w:shd w:fill="auto" w:val="clear"/>
-        </w:rPr>
-      </w:pPr>
-      <w:r>
-        <w:rPr>
-          <w:shd w:fill="auto" w:val="clear"/>
-        </w:rPr>
-      </w:r>
-    </w:p>
-    <w:p>
-      <w:pPr>
-        <w:pStyle w:val="Premirepage"/>
-        <w:rPr>
-          <w:shd w:fill="auto" w:val="clear"/>
-        </w:rPr>
-      </w:pPr>
-      <w:r>
-        <w:rPr>
-          <w:shd w:fill="auto" w:val="clear"/>
-        </w:rPr>
-      </w:r>
-    </w:p>
-    <w:p>
-      <w:pPr>
-        <w:pStyle w:val="Premirepage"/>
-        <w:rPr>
-          <w:shd w:fill="auto" w:val="clear"/>
-        </w:rPr>
-      </w:pPr>
-      <w:r>
-        <w:rPr>
-          <w:shd w:fill="auto" w:val="clear"/>
-        </w:rPr>
-      </w:r>
-    </w:p>
-    <w:p>
-      <w:pPr>
-        <w:pStyle w:val="Premirepage"/>
-        <w:rPr>
-          <w:shd w:fill="auto" w:val="clear"/>
-        </w:rPr>
-      </w:pPr>
-      <w:r>
-        <w:rPr>
-          <w:shd w:fill="auto" w:val="clear"/>
-        </w:rPr>
-        <w:t xml:space="preserve">PAR </w:t>
-      </w:r>
-    </w:p>
-    <w:p>
-      <w:pPr>
-        <w:pStyle w:val="Premirepage"/>
-        <w:rPr>
-          <w:shd w:fill="auto" w:val="clear"/>
-        </w:rPr>
-      </w:pPr>
-      <w:r>
-        <w:rPr>
-          <w:shd w:fill="auto" w:val="clear"/>
-        </w:rPr>
-        <w:t>[NOM]</w:t>
-      </w:r>
-    </w:p>
-    <w:p>
-      <w:pPr>
-        <w:pStyle w:val="Premirepage"/>
-        <w:rPr>
-          <w:shd w:fill="auto" w:val="clear"/>
-        </w:rPr>
-      </w:pPr>
-      <w:r>
-        <w:rPr>
-          <w:shd w:fill="auto" w:val="clear"/>
-        </w:rPr>
-      </w:r>
-    </w:p>
-    <w:p>
-      <w:pPr>
-        <w:pStyle w:val="Premirepage"/>
-        <w:rPr>
-          <w:shd w:fill="auto" w:val="clear"/>
-        </w:rPr>
-      </w:pPr>
-      <w:r>
-        <w:rPr>
-          <w:shd w:fill="auto" w:val="clear"/>
-        </w:rPr>
-      </w:r>
-    </w:p>
-    <w:p>
-      <w:pPr>
-        <w:pStyle w:val="Premirepage"/>
-        <w:rPr>
-          <w:shd w:fill="auto" w:val="clear"/>
-        </w:rPr>
-      </w:pPr>
-      <w:r>
-        <w:rPr>
-          <w:shd w:fill="auto" w:val="clear"/>
-        </w:rPr>
-      </w:r>
-    </w:p>
-    <w:p>
-      <w:pPr>
-        <w:pStyle w:val="Premirepage"/>
-        <w:rPr>
-          <w:shd w:fill="auto" w:val="clear"/>
-        </w:rPr>
-      </w:pPr>
-      <w:r>
-        <w:rPr>
-          <w:shd w:fill="auto" w:val="clear"/>
-        </w:rPr>
-      </w:r>
-    </w:p>
-    <w:p>
-      <w:pPr>
-        <w:pStyle w:val="Premirepage"/>
-        <w:rPr>
-          <w:shd w:fill="auto" w:val="clear"/>
-        </w:rPr>
-      </w:pPr>
-      <w:r>
-        <w:rPr>
-          <w:shd w:fill="auto" w:val="clear"/>
-        </w:rPr>
-      </w:r>
-    </w:p>
-    <w:p>
-      <w:pPr>
-        <w:pStyle w:val="Premirepage"/>
-        <w:rPr>
-          <w:shd w:fill="auto" w:val="clear"/>
-        </w:rPr>
-      </w:pPr>
-      <w:r>
-        <w:rPr>
-          <w:shd w:fill="auto" w:val="clear"/>
-        </w:rPr>
-        <w:t>7</w:t>
-      </w:r>
-      <w:r>
-        <w:rPr>
-          <w:shd w:fill="auto" w:val="clear"/>
-        </w:rPr>
-        <w:t xml:space="preserve"> FÉVRIER 202</w:t>
-      </w:r>
-      <w:r>
-        <w:rPr>
-          <w:shd w:fill="auto" w:val="clear"/>
-        </w:rPr>
-        <w:t>6</w:t>
+        <w:t>7 FÉVRIER 2026</w:t>
       </w:r>
       <w:r>
         <w:br w:type="page"/>
@@ -358,6 +328,8 @@
     <w:p>
       <w:pPr>
         <w:pStyle w:val="Heading1"/>
+        <w:spacing w:before="0" w:after="0"/>
+        <w:ind w:hanging="0" w:left="432"/>
         <w:rPr/>
       </w:pPr>
       <w:bookmarkStart w:id="0" w:name="__RefHeading___Toc1291_1922954643"/>
@@ -396,6 +368,7 @@
     <w:p>
       <w:pPr>
         <w:pStyle w:val="BodyText"/>
+        <w:spacing w:before="0" w:after="140"/>
         <w:rPr/>
       </w:pPr>
       <w:r>
@@ -413,6 +386,7 @@
         <w:p>
           <w:pPr>
             <w:pStyle w:val="Heading1"/>
+            <w:ind w:hanging="0" w:left="432"/>
             <w:rPr/>
           </w:pPr>
           <w:r>
@@ -452,6 +426,11 @@
                 <w:rStyle w:val="Sautdindex"/>
               </w:rPr>
               <w:tab/>
+            </w:r>
+            <w:r>
+              <w:rPr>
+                <w:rStyle w:val="Sautdindex"/>
+              </w:rPr>
               <w:t>RÉSUMÉ</w:t>
               <w:tab/>
               <w:t>ii</w:t>
@@ -1020,31 +999,7 @@
       </w:pPr>
       <w:r>
         <w:rPr/>
-        <w:t>La section des remerciements est dévolue à l'expression formelle de la gratitude de l'auteur envers les contributeurs ayant permis l'aboutissement du rapport, qu'il s'agisse de soutien pédagogique, institutionnel ou financier. Il est d'usage d'y inclure l'encadrement fourni par le professeur responsable, tel qu</w:t>
-      </w:r>
-      <w:r>
-        <w:rPr/>
-        <w:t>e X</w:t>
-      </w:r>
-      <w:r>
-        <w:rPr/>
-        <w:t xml:space="preserve">, ainsi que l'appui de l'Université </w:t>
-      </w:r>
-      <w:r>
-        <w:rPr/>
-        <w:t>X</w:t>
-      </w:r>
-      <w:r>
-        <w:rPr/>
-        <w:t xml:space="preserve"> concernant l'accès aux infrastructures de recherche. La mention de partenaires techniques ou d'associations, comme </w:t>
-      </w:r>
-      <w:r>
-        <w:rPr/>
-        <w:t>X</w:t>
-      </w:r>
-      <w:r>
-        <w:rPr/>
-        <w:t>, renforce l'ancrage institutionnel du travail. D'un point de vue de la psychologie cognitive, isoler ces gratitudes dans un espace dédié permet de maintenir la neutralité tonale nécessaire au reste du document scientifique.</w:t>
+        <w:t>La section des remerciements est dévolue à l'expression formelle de la gratitude de l'auteur envers les contributeurs ayant permis l'aboutissement du rapport, qu'il s'agisse de soutien pédagogique, institutionnel ou financier. Il est d'usage d'y inclure l'encadrement fourni par le professeur responsable, tel que X, ainsi que l'appui de l'Université X concernant l'accès aux infrastructures de recherche. La mention de partenaires techniques ou d'associations, comme X, renforce l'ancrage institutionnel du travail. D'un point de vue de la psychologie cognitive, isoler ces gratitudes dans un espace dédié permet de maintenir la neutralité tonale nécessaire au reste du document scientifique.</w:t>
       </w:r>
       <w:r>
         <w:br w:type="page"/>
@@ -1053,6 +1008,7 @@
     <w:p>
       <w:pPr>
         <w:pStyle w:val="BodyText"/>
+        <w:spacing w:before="0" w:after="140"/>
         <w:ind w:hanging="0" w:left="0" w:right="0"/>
         <w:rPr/>
       </w:pPr>
@@ -1063,6 +1019,7 @@
     <w:p>
       <w:pPr>
         <w:pStyle w:val="Heading1"/>
+        <w:ind w:hanging="0" w:left="432"/>
         <w:rPr/>
       </w:pPr>
       <w:r>
@@ -1100,6 +1057,11 @@
             <w:rStyle w:val="Sautdindex"/>
           </w:rPr>
           <w:t>Figure 1: Ceci est la légende de la figure.</w:t>
+        </w:r>
+        <w:r>
+          <w:rPr>
+            <w:rStyle w:val="Sautdindex"/>
+          </w:rPr>
           <w:tab/>
           <w:t>1</w:t>
         </w:r>
@@ -1181,15 +1143,17 @@
       <w:r>
         <w:rPr/>
       </w:r>
+      <w:r>
+        <w:br w:type="page"/>
+      </w:r>
     </w:p>
     <w:p>
       <w:pPr>
         <w:pStyle w:val="Heading1"/>
-        <w:rPr/>
-      </w:pPr>
-      <w:r>
-        <w:br w:type="page"/>
-      </w:r>
+        <w:spacing w:before="0" w:after="0"/>
+        <w:ind w:hanging="0" w:left="432"/>
+        <w:rPr/>
+      </w:pPr>
       <w:r>
         <w:rPr/>
         <w:t>INDEX DES TABLEAUX</w:t>
@@ -1197,11 +1161,12 @@
     </w:p>
     <w:p>
       <w:pPr>
-        <w:pStyle w:val="Indexdetableaux1"/>
+        <w:pStyle w:val="Indexdetableaux1user"/>
         <w:tabs>
           <w:tab w:val="clear" w:pos="9072"/>
           <w:tab w:val="right" w:pos="9015" w:leader="dot"/>
         </w:tabs>
+        <w:spacing w:before="0" w:after="160"/>
         <w:rPr/>
       </w:pPr>
       <w:r>
@@ -1225,6 +1190,11 @@
             <w:rStyle w:val="Sautdindex"/>
           </w:rPr>
           <w:t>Tableau 1: Ceci est mon tableau</w:t>
+        </w:r>
+        <w:r>
+          <w:rPr>
+            <w:rStyle w:val="Sautdindex"/>
+          </w:rPr>
           <w:tab/>
           <w:t>2</w:t>
         </w:r>
@@ -1239,8 +1209,9 @@
     <w:p>
       <w:pPr>
         <w:sectPr>
-          <w:footerReference w:type="default" r:id="rId2"/>
-          <w:footerReference w:type="first" r:id="rId3"/>
+          <w:footerReference w:type="even" r:id="rId2"/>
+          <w:footerReference w:type="default" r:id="rId3"/>
+          <w:footerReference w:type="first" r:id="rId4"/>
           <w:type w:val="nextPage"/>
           <w:pgSz w:w="11906" w:h="16838"/>
           <w:pgMar w:left="1445" w:right="1445" w:gutter="0" w:header="0" w:top="1445" w:footer="736" w:bottom="1445"/>
@@ -1250,17 +1221,12 @@
           <w:textDirection w:val="lrTb"/>
           <w:docGrid w:type="default" w:linePitch="360" w:charSpace="0"/>
         </w:sectPr>
-        <w:pStyle w:val="Normal"/>
-        <w:spacing w:before="0" w:after="160"/>
-        <w:rPr/>
-      </w:pPr>
-      <w:r>
-        <w:rPr/>
-      </w:r>
+      </w:pPr>
     </w:p>
     <w:p>
       <w:pPr>
         <w:pStyle w:val="Heading1"/>
+        <w:ind w:hanging="0" w:left="432"/>
         <w:rPr/>
       </w:pPr>
       <w:bookmarkStart w:id="8" w:name="__RefHeading___Toc1301_1922954643"/>
@@ -1278,16 +1244,12 @@
     </w:p>
     <w:p>
       <w:pPr>
-        <w:pStyle w:val="Commentaire"/>
-        <w:rPr/>
-      </w:pPr>
-      <w:r>
-        <w:rPr/>
-        <w:t xml:space="preserve">Commentaire : Ceci est un commentaire de partie, </w:t>
-      </w:r>
-      <w:r>
-        <w:rPr/>
-        <w:t>il peut servire à résumer ou contextualiser la partie à venir.</w:t>
+        <w:pStyle w:val="Commentaireuser"/>
+        <w:rPr/>
+      </w:pPr>
+      <w:r>
+        <w:rPr/>
+        <w:t>Commentaire : Ceci est un commentaire de partie, il peut servire à résumer ou contextualiser la partie à venir.</w:t>
       </w:r>
     </w:p>
     <w:p>
@@ -1305,15 +1267,7 @@
       <w:bookmarkEnd w:id="10"/>
       <w:r>
         <w:rPr/>
-        <w:t>M</w:t>
-      </w:r>
-      <w:r>
-        <w:rPr/>
-        <w:t>a</w:t>
-      </w:r>
-      <w:r>
-        <w:rPr/>
-        <w:t xml:space="preserve"> sous-</w:t>
+        <w:t>Ma sous-</w:t>
       </w:r>
       <w:bookmarkEnd w:id="11"/>
       <w:r>
@@ -1335,7 +1289,7 @@
       </w:r>
       <w:r>
         <w:rPr/>
-        <w:instrText xml:space="preserve"> XE "contenu" </w:instrText>
+        <w:instrText xml:space="preserve"> XE "contenu: : : " </w:instrText>
       </w:r>
       <w:r>
         <w:rPr/>
@@ -1343,7 +1297,6 @@
       </w:r>
       <w:r>
         <w:rPr/>
-        <w:t>contenu</w:t>
       </w:r>
       <w:r>
         <w:rPr/>
@@ -1351,27 +1304,7 @@
       </w:r>
       <w:r>
         <w:rPr/>
-        <w:t xml:space="preserve"> de ma sous partie, </w:t>
-      </w:r>
-      <w:r>
-        <w:rPr/>
-        <w:t>elle contient du texte avec une interligen de deux. Elle est justifié et à une police de 12</w:t>
-      </w:r>
-      <w:r>
-        <w:rPr/>
-        <w:t xml:space="preserve">. </w:t>
-      </w:r>
-      <w:r>
-        <w:rPr/>
-        <w:t xml:space="preserve">Elle contient </w:t>
-      </w:r>
-      <w:r>
-        <w:rPr/>
-        <w:t>aussi</w:t>
-      </w:r>
-      <w:r>
-        <w:rPr/>
-        <w:t xml:space="preserve"> « </w:t>
+        <w:t>contenu de ma sous partie, elle contient du texte avec une interligen de deux. Elle est justifié et à une police de 12. Elle contient aussi « </w:t>
       </w:r>
       <w:r>
         <w:rPr/>
@@ -1395,11 +1328,7 @@
       </w:r>
       <w:r>
         <w:rPr/>
-        <w:t xml:space="preserve"> ». </w:t>
-      </w:r>
-      <w:r>
-        <w:rPr/>
-        <w:t>Pour avoir un rendu similaire, il faut faire insérer image puis ajouter une légende. Ensuite il est possible de faire un renvoie à la figure quand on l’évoque dans le texte.</w:t>
+        <w:t> ». Pour avoir un rendu similaire, il faut faire insérer image puis ajouter une légende. Ensuite il est possible de faire un renvoie à la figure quand on l’évoque dans le texte.</w:t>
       </w:r>
     </w:p>
     <w:p>
@@ -1409,12 +1338,10 @@
       </w:pPr>
       <w:r>
         <w:rPr/>
-      </w:r>
-      <w:r>
         <mc:AlternateContent>
           <mc:Choice Requires="wps">
             <w:drawing>
-              <wp:anchor behindDoc="0" distT="0" distB="0" distL="0" distR="0" simplePos="0" locked="0" layoutInCell="0" allowOverlap="1" relativeHeight="2">
+              <wp:anchor distT="0" distB="0" distL="0" distR="0" simplePos="0" relativeHeight="2" behindDoc="0" locked="0" layoutInCell="0" allowOverlap="1">
                 <wp:simplePos x="0" y="0"/>
                 <wp:positionH relativeFrom="column">
                   <wp:align>center</wp:align>
@@ -1429,17 +1356,28 @@
                 <a:graphic xmlns:a="http://schemas.openxmlformats.org/drawingml/2006/main">
                   <a:graphicData uri="http://schemas.microsoft.com/office/word/2010/wordprocessingShape">
                     <wps:wsp>
-                      <wps:cNvSpPr txBox="1"/>
+                      <wps:cNvSpPr/>
                       <wps:spPr>
                         <a:xfrm>
                           <a:off x="0" y="0"/>
-                          <a:ext cx="5760720" cy="3448685"/>
+                          <a:ext cx="5760720" cy="3448800"/>
                         </a:xfrm>
-                        <a:prstGeom prst="rect"/>
+                        <a:prstGeom prst="rect">
+                          <a:avLst/>
+                        </a:prstGeom>
                         <a:solidFill>
-                          <a:srgbClr val="FFFFFF"/>
+                          <a:srgbClr val="ffffff"/>
                         </a:solidFill>
+                        <a:ln w="0">
+                          <a:noFill/>
+                        </a:ln>
                       </wps:spPr>
+                      <wps:style>
+                        <a:lnRef idx="0"/>
+                        <a:fillRef idx="0"/>
+                        <a:effectRef idx="0"/>
+                        <a:fontRef idx="minor"/>
+                      </wps:style>
                       <wps:txbx>
                         <w:txbxContent>
                           <w:p>
@@ -1449,12 +1387,14 @@
                               <w:rPr/>
                             </w:pPr>
                             <w:r>
-                              <w:rPr/>
+                              <w:rPr>
+                                <w:color w:val="000000"/>
+                              </w:rPr>
                               <w:drawing>
                                 <wp:inline distT="0" distB="0" distL="0" distR="0">
                                   <wp:extent cx="5588000" cy="3107055"/>
                                   <wp:effectExtent l="0" t="0" r="0" b="0"/>
-                                  <wp:docPr id="2" name="Image1" descr=""/>
+                                  <wp:docPr id="2" name="Image1"/>
                                   <wp:cNvGraphicFramePr>
                                     <a:graphicFrameLocks xmlns:a="http://schemas.openxmlformats.org/drawingml/2006/main" noChangeAspect="1"/>
                                   </wp:cNvGraphicFramePr>
@@ -1462,13 +1402,13 @@
                                     <a:graphicData uri="http://schemas.openxmlformats.org/drawingml/2006/picture">
                                       <pic:pic xmlns:pic="http://schemas.openxmlformats.org/drawingml/2006/picture">
                                         <pic:nvPicPr>
-                                          <pic:cNvPr id="2" name="Image1" descr=""/>
+                                          <pic:cNvPr id="2" name="Image1"/>
                                           <pic:cNvPicPr>
                                             <a:picLocks noChangeAspect="1" noChangeArrowheads="1"/>
                                           </pic:cNvPicPr>
                                         </pic:nvPicPr>
                                         <pic:blipFill>
-                                          <a:blip r:embed="rId4"/>
+                                          <a:blip r:embed="rId5"/>
                                           <a:srcRect l="-41" t="-73" r="-41" b="-73"/>
                                           <a:stretch>
                                             <a:fillRect/>
@@ -1489,42 +1429,61 @@
                                   </a:graphic>
                                 </wp:inline>
                               </w:drawing>
+                            </w:r>
+                            <w:r>
+                              <w:rPr>
+                                <w:color w:val="000000"/>
+                              </w:rPr>
                               <w:t xml:space="preserve">Figure </w:t>
                             </w:r>
                             <w:r>
-                              <w:rPr/>
+                              <w:rPr>
+                                <w:color w:val="000000"/>
+                              </w:rPr>
                               <w:fldChar w:fldCharType="begin"/>
                             </w:r>
                             <w:r>
-                              <w:rPr/>
+                              <w:rPr>
+                                <w:color w:val="000000"/>
+                              </w:rPr>
                               <w:instrText xml:space="preserve"> SEQ Figure \* ARABIC </w:instrText>
                             </w:r>
                             <w:r>
-                              <w:rPr/>
+                              <w:rPr>
+                                <w:color w:val="000000"/>
+                              </w:rPr>
                               <w:fldChar w:fldCharType="separate"/>
                             </w:r>
                             <w:r>
-                              <w:rPr/>
+                              <w:rPr>
+                                <w:color w:val="000000"/>
+                              </w:rPr>
                               <w:t>1</w:t>
                             </w:r>
                             <w:r>
-                              <w:rPr/>
+                              <w:rPr>
+                                <w:color w:val="000000"/>
+                              </w:rPr>
                               <w:fldChar w:fldCharType="end"/>
                             </w:r>
                             <w:r>
-                              <w:rPr/>
+                              <w:rPr>
+                                <w:color w:val="000000"/>
+                              </w:rPr>
                               <w:t xml:space="preserve">: </w:t>
                             </w:r>
                             <w:bookmarkStart w:id="12" w:name="Ref_Figure0_caption_only"/>
                             <w:r>
-                              <w:rPr/>
+                              <w:rPr>
+                                <w:color w:val="000000"/>
+                              </w:rPr>
                               <w:t>Ceci est la légende de la figure.</w:t>
                             </w:r>
                             <w:bookmarkEnd w:id="12"/>
                           </w:p>
                         </w:txbxContent>
                       </wps:txbx>
-                      <wps:bodyPr anchor="t" lIns="0" tIns="0" rIns="0" bIns="0">
+                      <wps:bodyPr lIns="0" rIns="0" tIns="0" bIns="0" anchor="t">
                         <a:noAutofit/>
                       </wps:bodyPr>
                     </wps:wsp>
@@ -1535,8 +1494,10 @@
           </mc:Choice>
           <mc:Fallback>
             <w:pict>
-              <v:rect style="position:absolute;rotation:-0;width:453.6pt;height:271.55pt;mso-wrap-distance-left:0pt;mso-wrap-distance-right:0pt;mso-wrap-distance-top:0pt;mso-wrap-distance-bottom:0pt;margin-top:0pt;mso-position-vertical:top;mso-position-vertical-relative:text;margin-left:0pt;mso-position-horizontal:center;mso-position-horizontal-relative:text">
-                <v:textbox inset="0in,0in,0in,0in">
+              <v:rect id="shape_0" fillcolor="white" stroked="f" o:allowincell="f" style="position:absolute;margin-left:0pt;margin-top:0.05pt;width:453.55pt;height:271.5pt;mso-wrap-style:square;v-text-anchor:top;mso-position-horizontal:center">
+                <v:fill o:detectmouseclick="t" type="solid" color2="black"/>
+                <v:stroke color="#3465a4" joinstyle="round" endcap="flat"/>
+                <v:textbox>
                   <w:txbxContent>
                     <w:p>
                       <w:pPr>
@@ -1545,12 +1506,14 @@
                         <w:rPr/>
                       </w:pPr>
                       <w:r>
-                        <w:rPr/>
+                        <w:rPr>
+                          <w:color w:val="000000"/>
+                        </w:rPr>
                         <w:drawing>
                           <wp:inline distT="0" distB="0" distL="0" distR="0">
                             <wp:extent cx="5588000" cy="3107055"/>
                             <wp:effectExtent l="0" t="0" r="0" b="0"/>
-                            <wp:docPr id="3" name="Image1" descr=""/>
+                            <wp:docPr id="3" name="Image1"/>
                             <wp:cNvGraphicFramePr>
                               <a:graphicFrameLocks xmlns:a="http://schemas.openxmlformats.org/drawingml/2006/main" noChangeAspect="1"/>
                             </wp:cNvGraphicFramePr>
@@ -1558,13 +1521,13 @@
                               <a:graphicData uri="http://schemas.openxmlformats.org/drawingml/2006/picture">
                                 <pic:pic xmlns:pic="http://schemas.openxmlformats.org/drawingml/2006/picture">
                                   <pic:nvPicPr>
-                                    <pic:cNvPr id="3" name="Image1" descr=""/>
+                                    <pic:cNvPr id="3" name="Image1"/>
                                     <pic:cNvPicPr>
                                       <a:picLocks noChangeAspect="1" noChangeArrowheads="1"/>
                                     </pic:cNvPicPr>
                                   </pic:nvPicPr>
                                   <pic:blipFill>
-                                    <a:blip r:embed="rId5"/>
+                                    <a:blip r:embed="rId6"/>
                                     <a:srcRect l="-41" t="-73" r="-41" b="-73"/>
                                     <a:stretch>
                                       <a:fillRect/>
@@ -1585,35 +1548,54 @@
                             </a:graphic>
                           </wp:inline>
                         </w:drawing>
+                      </w:r>
+                      <w:r>
+                        <w:rPr>
+                          <w:color w:val="000000"/>
+                        </w:rPr>
                         <w:t xml:space="preserve">Figure </w:t>
                       </w:r>
                       <w:r>
-                        <w:rPr/>
+                        <w:rPr>
+                          <w:color w:val="000000"/>
+                        </w:rPr>
                         <w:fldChar w:fldCharType="begin"/>
                       </w:r>
                       <w:r>
-                        <w:rPr/>
+                        <w:rPr>
+                          <w:color w:val="000000"/>
+                        </w:rPr>
                         <w:instrText xml:space="preserve"> SEQ Figure \* ARABIC </w:instrText>
                       </w:r>
                       <w:r>
-                        <w:rPr/>
+                        <w:rPr>
+                          <w:color w:val="000000"/>
+                        </w:rPr>
                         <w:fldChar w:fldCharType="separate"/>
                       </w:r>
                       <w:r>
-                        <w:rPr/>
+                        <w:rPr>
+                          <w:color w:val="000000"/>
+                        </w:rPr>
                         <w:t>1</w:t>
                       </w:r>
                       <w:r>
-                        <w:rPr/>
+                        <w:rPr>
+                          <w:color w:val="000000"/>
+                        </w:rPr>
                         <w:fldChar w:fldCharType="end"/>
                       </w:r>
                       <w:r>
-                        <w:rPr/>
+                        <w:rPr>
+                          <w:color w:val="000000"/>
+                        </w:rPr>
                         <w:t xml:space="preserve">: </w:t>
                       </w:r>
                       <w:bookmarkStart w:id="13" w:name="Ref_Figure0_caption_only"/>
                       <w:r>
-                        <w:rPr/>
+                        <w:rPr>
+                          <w:color w:val="000000"/>
+                        </w:rPr>
                         <w:t>Ceci est la légende de la figure.</w:t>
                       </w:r>
                       <w:bookmarkEnd w:id="13"/>
@@ -1642,15 +1624,7 @@
       <w:bookmarkEnd w:id="14"/>
       <w:r>
         <w:rPr/>
-        <w:t>M</w:t>
-      </w:r>
-      <w:r>
-        <w:rPr/>
-        <w:t>a</w:t>
-      </w:r>
-      <w:r>
-        <w:rPr/>
-        <w:t xml:space="preserve"> sous-</w:t>
+        <w:t>Ma sous-</w:t>
       </w:r>
       <w:bookmarkEnd w:id="15"/>
       <w:r>
@@ -1672,7 +1646,7 @@
       </w:r>
       <w:r>
         <w:rPr/>
-        <w:instrText xml:space="preserve"> XE "contenu" </w:instrText>
+        <w:instrText xml:space="preserve"> XE "contenu: : : " </w:instrText>
       </w:r>
       <w:r>
         <w:rPr/>
@@ -1680,7 +1654,6 @@
       </w:r>
       <w:r>
         <w:rPr/>
-        <w:t>contenu</w:t>
       </w:r>
       <w:r>
         <w:rPr/>
@@ -1688,27 +1661,7 @@
       </w:r>
       <w:r>
         <w:rPr/>
-        <w:t xml:space="preserve"> de ma sous partie, </w:t>
-      </w:r>
-      <w:r>
-        <w:rPr/>
-        <w:t>elle contient du texte avec une interligen de deux. Elle est justifié et à une police de 12</w:t>
-      </w:r>
-      <w:r>
-        <w:rPr/>
-        <w:t xml:space="preserve">. </w:t>
-      </w:r>
-      <w:r>
-        <w:rPr/>
-        <w:t xml:space="preserve">Elle contient </w:t>
-      </w:r>
-      <w:r>
-        <w:rPr/>
-        <w:t>aussi</w:t>
-      </w:r>
-      <w:r>
-        <w:rPr/>
-        <w:t xml:space="preserve"> «</w:t>
+        <w:t>contenu de ma sous partie, elle contient du texte avec une interligen de deux. Elle est justifié et à une police de 12. Elle contient aussi «</w:t>
       </w:r>
       <w:r>
         <w:rPr/>
@@ -1732,11 +1685,7 @@
       </w:r>
       <w:r>
         <w:rPr/>
-        <w:t xml:space="preserve">». </w:t>
-      </w:r>
-      <w:r>
-        <w:rPr/>
-        <w:t>Pour avoir un rendu similaire, il faut faire insérer tableau puis ajouter une légende. Ensuite il est possible de faire un renvoie au tableau quand on l’évoque dans le texte.</w:t>
+        <w:t>». Pour avoir un rendu similaire, il faut faire insérer tableau puis ajouter une légende. Ensuite il est possible de faire un renvoie au tableau quand on l’évoque dans le texte.</w:t>
       </w:r>
     </w:p>
     <w:p>
@@ -1775,7 +1724,7 @@
           </w:tcPr>
           <w:p>
             <w:pPr>
-              <w:pStyle w:val="Contenudetableau"/>
+              <w:pStyle w:val="Contenudetableauuser"/>
               <w:keepNext w:val="true"/>
               <w:widowControl w:val="false"/>
               <w:suppressLineNumbers/>
@@ -1794,7 +1743,7 @@
           </w:tcPr>
           <w:p>
             <w:pPr>
-              <w:pStyle w:val="Contenudetableau"/>
+              <w:pStyle w:val="Contenudetableauuser"/>
               <w:widowControl w:val="false"/>
               <w:suppressLineNumbers/>
               <w:spacing w:before="0" w:after="160"/>
@@ -1812,7 +1761,7 @@
           </w:tcPr>
           <w:p>
             <w:pPr>
-              <w:pStyle w:val="Contenudetableau"/>
+              <w:pStyle w:val="Contenudetableauuser"/>
               <w:widowControl w:val="false"/>
               <w:suppressLineNumbers/>
               <w:spacing w:before="0" w:after="160"/>
@@ -1833,7 +1782,7 @@
           </w:tcPr>
           <w:p>
             <w:pPr>
-              <w:pStyle w:val="Contenudetableau"/>
+              <w:pStyle w:val="Contenudetableauuser"/>
               <w:keepNext w:val="true"/>
               <w:widowControl w:val="false"/>
               <w:suppressLineNumbers/>
@@ -1852,7 +1801,7 @@
           </w:tcPr>
           <w:p>
             <w:pPr>
-              <w:pStyle w:val="Contenudetableau"/>
+              <w:pStyle w:val="Contenudetableauuser"/>
               <w:widowControl w:val="false"/>
               <w:suppressLineNumbers/>
               <w:spacing w:before="0" w:after="160"/>
@@ -1870,7 +1819,7 @@
           </w:tcPr>
           <w:p>
             <w:pPr>
-              <w:pStyle w:val="Contenudetableau"/>
+              <w:pStyle w:val="Contenudetableauuser"/>
               <w:widowControl w:val="false"/>
               <w:suppressLineNumbers/>
               <w:spacing w:before="0" w:after="160"/>
@@ -1891,7 +1840,7 @@
           </w:tcPr>
           <w:p>
             <w:pPr>
-              <w:pStyle w:val="Contenudetableau"/>
+              <w:pStyle w:val="Contenudetableauuser"/>
               <w:keepNext w:val="true"/>
               <w:widowControl w:val="false"/>
               <w:suppressLineNumbers/>
@@ -1910,7 +1859,7 @@
           </w:tcPr>
           <w:p>
             <w:pPr>
-              <w:pStyle w:val="Contenudetableau"/>
+              <w:pStyle w:val="Contenudetableauuser"/>
               <w:widowControl w:val="false"/>
               <w:suppressLineNumbers/>
               <w:spacing w:before="0" w:after="160"/>
@@ -1928,7 +1877,7 @@
           </w:tcPr>
           <w:p>
             <w:pPr>
-              <w:pStyle w:val="Contenudetableau"/>
+              <w:pStyle w:val="Contenudetableauuser"/>
               <w:widowControl w:val="false"/>
               <w:suppressLineNumbers/>
               <w:spacing w:before="0" w:after="160"/>
@@ -1949,7 +1898,7 @@
           </w:tcPr>
           <w:p>
             <w:pPr>
-              <w:pStyle w:val="Contenudetableau"/>
+              <w:pStyle w:val="Contenudetableauuser"/>
               <w:keepNext w:val="true"/>
               <w:widowControl w:val="false"/>
               <w:suppressLineNumbers/>
@@ -1968,7 +1917,7 @@
           </w:tcPr>
           <w:p>
             <w:pPr>
-              <w:pStyle w:val="Contenudetableau"/>
+              <w:pStyle w:val="Contenudetableauuser"/>
               <w:widowControl w:val="false"/>
               <w:suppressLineNumbers/>
               <w:spacing w:before="0" w:after="160"/>
@@ -1986,7 +1935,7 @@
           </w:tcPr>
           <w:p>
             <w:pPr>
-              <w:pStyle w:val="Contenudetableau"/>
+              <w:pStyle w:val="Contenudetableauuser"/>
               <w:widowControl w:val="false"/>
               <w:suppressLineNumbers/>
               <w:spacing w:before="0" w:after="160"/>
@@ -2001,7 +1950,7 @@
     </w:tbl>
     <w:p>
       <w:pPr>
-        <w:pStyle w:val="Tableau"/>
+        <w:pStyle w:val="Tableauuser"/>
         <w:rPr/>
       </w:pPr>
       <w:r>
@@ -2035,21 +1984,13 @@
       <w:bookmarkStart w:id="16" w:name="Ref_Tableau0_caption_only"/>
       <w:r>
         <w:rPr/>
-        <w:t xml:space="preserve">Ceci est </w:t>
-      </w:r>
-      <w:r>
-        <w:rPr/>
-        <w:t xml:space="preserve">la légende de </w:t>
-      </w:r>
-      <w:r>
-        <w:rPr/>
-        <w:t>mon tableau</w:t>
+        <w:t>Ceci est la légende de mon tableau</w:t>
       </w:r>
       <w:bookmarkEnd w:id="16"/>
     </w:p>
     <w:p>
       <w:pPr>
-        <w:pStyle w:val="Tableau"/>
+        <w:pStyle w:val="Tableauuser"/>
         <w:rPr/>
       </w:pPr>
       <w:r>
@@ -2071,15 +2012,7 @@
       <w:bookmarkEnd w:id="17"/>
       <w:r>
         <w:rPr/>
-        <w:t>M</w:t>
-      </w:r>
-      <w:r>
-        <w:rPr/>
-        <w:t>a</w:t>
-      </w:r>
-      <w:r>
-        <w:rPr/>
-        <w:t xml:space="preserve"> sous-</w:t>
+        <w:t>Ma sous-</w:t>
       </w:r>
       <w:bookmarkEnd w:id="18"/>
       <w:r>
@@ -2101,7 +2034,7 @@
       </w:r>
       <w:r>
         <w:rPr/>
-        <w:instrText xml:space="preserve"> XE "contenu" </w:instrText>
+        <w:instrText xml:space="preserve"> XE "contenu: : : " </w:instrText>
       </w:r>
       <w:r>
         <w:rPr/>
@@ -2109,7 +2042,6 @@
       </w:r>
       <w:r>
         <w:rPr/>
-        <w:t>contenu</w:t>
       </w:r>
       <w:r>
         <w:rPr/>
@@ -2117,35 +2049,7 @@
       </w:r>
       <w:r>
         <w:rPr/>
-        <w:t xml:space="preserve"> de ma sous partie, </w:t>
-      </w:r>
-      <w:r>
-        <w:rPr/>
-        <w:t>elle contient du texte avec une interligen de deux. Elle est justifié et à une police de 12</w:t>
-      </w:r>
-      <w:r>
-        <w:rPr/>
-        <w:t xml:space="preserve">. </w:t>
-      </w:r>
-      <w:r>
-        <w:rPr/>
-        <w:t xml:space="preserve">Elle contient </w:t>
-      </w:r>
-      <w:r>
-        <w:rPr/>
-        <w:t>aussi</w:t>
-      </w:r>
-      <w:r>
-        <w:rPr/>
-        <w:t xml:space="preserve"> </w:t>
-      </w:r>
-      <w:r>
-        <w:rPr/>
-        <w:t xml:space="preserve">un mot compliqué ou acronyme qui renvoie au glossaire. </w:t>
-      </w:r>
-      <w:r>
-        <w:rPr/>
-        <w:t xml:space="preserve">Le mot est : </w:t>
+        <w:t xml:space="preserve">contenu de ma sous partie, elle contient du texte avec une interligen de deux. Elle est justifié et à une police de 12. Elle contient aussi un mot compliqué ou acronyme qui renvoie au glossaire. Le mot est : </w:t>
       </w:r>
       <w:r>
         <w:fldChar w:fldCharType="begin"/>
@@ -2160,7 +2064,6 @@
       </w:r>
       <w:r>
         <w:rPr/>
-        <w:t>AGE</w:t>
       </w:r>
       <w:r>
         <w:rPr/>
@@ -2168,7 +2071,7 @@
       </w:r>
       <w:r>
         <w:rPr/>
-        <w:t>.</w:t>
+        <w:t>AGE.</w:t>
       </w:r>
     </w:p>
     <w:p>
@@ -2186,15 +2089,7 @@
       <w:bookmarkEnd w:id="19"/>
       <w:r>
         <w:rPr/>
-        <w:t>M</w:t>
-      </w:r>
-      <w:r>
-        <w:rPr/>
-        <w:t>a</w:t>
-      </w:r>
-      <w:r>
-        <w:rPr/>
-        <w:t xml:space="preserve"> sous-</w:t>
+        <w:t>Ma sous-</w:t>
       </w:r>
       <w:bookmarkEnd w:id="20"/>
       <w:r>
@@ -2216,7 +2111,7 @@
       </w:r>
       <w:r>
         <w:rPr/>
-        <w:instrText xml:space="preserve"> XE "contenu" </w:instrText>
+        <w:instrText xml:space="preserve"> XE "contenu: : : " </w:instrText>
       </w:r>
       <w:r>
         <w:rPr/>
@@ -2224,7 +2119,6 @@
       </w:r>
       <w:r>
         <w:rPr/>
-        <w:t>contenu</w:t>
       </w:r>
       <w:r>
         <w:rPr/>
@@ -2232,39 +2126,7 @@
       </w:r>
       <w:r>
         <w:rPr/>
-        <w:t xml:space="preserve"> de ma sous partie, </w:t>
-      </w:r>
-      <w:r>
-        <w:rPr/>
-        <w:t>elle contient du texte avec une interligen de deux. Elle est justifié et à une police de 12</w:t>
-      </w:r>
-      <w:r>
-        <w:rPr/>
-        <w:t xml:space="preserve">. </w:t>
-      </w:r>
-      <w:r>
-        <w:rPr/>
-        <w:t xml:space="preserve">Elle contient </w:t>
-      </w:r>
-      <w:r>
-        <w:rPr/>
-        <w:t>aussi</w:t>
-      </w:r>
-      <w:r>
-        <w:rPr/>
-        <w:t xml:space="preserve"> </w:t>
-      </w:r>
-      <w:r>
-        <w:rPr/>
-        <w:t>un</w:t>
-      </w:r>
-      <w:r>
-        <w:rPr/>
-        <w:t>e liste à puce</w:t>
-      </w:r>
-      <w:r>
-        <w:rPr/>
-        <w:t>.</w:t>
+        <w:t>contenu de ma sous partie, elle contient du texte avec une interligen de deux. Elle est justifié et à une police de 12. Elle contient aussi une liste à puce.</w:t>
       </w:r>
     </w:p>
     <w:p>
@@ -2335,6 +2197,8 @@
     <w:p>
       <w:pPr>
         <w:pStyle w:val="Heading1"/>
+        <w:spacing w:before="0" w:after="0"/>
+        <w:ind w:hanging="0" w:left="432"/>
         <w:rPr/>
       </w:pPr>
       <w:bookmarkStart w:id="21" w:name="__RefHeading___Toc1569_1922954643"/>
@@ -2352,16 +2216,12 @@
     </w:p>
     <w:p>
       <w:pPr>
-        <w:pStyle w:val="Commentaire"/>
-        <w:rPr/>
-      </w:pPr>
-      <w:r>
-        <w:rPr/>
-        <w:t xml:space="preserve">Commentaire : Ceci est un commentaire de partie, </w:t>
-      </w:r>
-      <w:r>
-        <w:rPr/>
-        <w:t>il peut servire à résumer ou contextualiser la partie à venir.</w:t>
+        <w:pStyle w:val="Commentaireuser"/>
+        <w:rPr/>
+      </w:pPr>
+      <w:r>
+        <w:rPr/>
+        <w:t>Commentaire : Ceci est un commentaire de partie, il peut servire à résumer ou contextualiser la partie à venir.</w:t>
       </w:r>
     </w:p>
     <w:p>
@@ -2379,15 +2239,7 @@
       <w:bookmarkEnd w:id="23"/>
       <w:r>
         <w:rPr/>
-        <w:t>M</w:t>
-      </w:r>
-      <w:r>
-        <w:rPr/>
-        <w:t>a</w:t>
-      </w:r>
-      <w:r>
-        <w:rPr/>
-        <w:t xml:space="preserve"> sous-</w:t>
+        <w:t>Ma sous-</w:t>
       </w:r>
       <w:bookmarkEnd w:id="24"/>
       <w:r>
@@ -2409,7 +2261,7 @@
       </w:r>
       <w:r>
         <w:rPr/>
-        <w:instrText xml:space="preserve"> XE "contenu" </w:instrText>
+        <w:instrText xml:space="preserve"> XE "contenu: : : " </w:instrText>
       </w:r>
       <w:r>
         <w:rPr/>
@@ -2417,7 +2269,6 @@
       </w:r>
       <w:r>
         <w:rPr/>
-        <w:t>contenu</w:t>
       </w:r>
       <w:r>
         <w:rPr/>
@@ -2425,7 +2276,7 @@
       </w:r>
       <w:r>
         <w:rPr/>
-        <w:t xml:space="preserve"> de ma sous partie.</w:t>
+        <w:t>contenu de ma sous partie.</w:t>
       </w:r>
     </w:p>
     <w:p>
@@ -2443,15 +2294,7 @@
       <w:bookmarkEnd w:id="25"/>
       <w:r>
         <w:rPr/>
-        <w:t>M</w:t>
-      </w:r>
-      <w:r>
-        <w:rPr/>
-        <w:t>a</w:t>
-      </w:r>
-      <w:r>
-        <w:rPr/>
-        <w:t xml:space="preserve"> sous-</w:t>
+        <w:t>Ma sous-</w:t>
       </w:r>
       <w:bookmarkEnd w:id="26"/>
       <w:r>
@@ -2473,7 +2316,7 @@
       </w:r>
       <w:r>
         <w:rPr/>
-        <w:instrText xml:space="preserve"> XE "contenu" </w:instrText>
+        <w:instrText xml:space="preserve"> XE "contenu: : : " </w:instrText>
       </w:r>
       <w:r>
         <w:rPr/>
@@ -2481,7 +2324,6 @@
       </w:r>
       <w:r>
         <w:rPr/>
-        <w:t>contenu</w:t>
       </w:r>
       <w:r>
         <w:rPr/>
@@ -2489,7 +2331,7 @@
       </w:r>
       <w:r>
         <w:rPr/>
-        <w:t xml:space="preserve"> de ma sous partie.</w:t>
+        <w:t>contenu de ma sous partie.</w:t>
       </w:r>
     </w:p>
     <w:p>
@@ -2507,15 +2349,7 @@
       <w:bookmarkEnd w:id="27"/>
       <w:r>
         <w:rPr/>
-        <w:t>M</w:t>
-      </w:r>
-      <w:r>
-        <w:rPr/>
-        <w:t>a</w:t>
-      </w:r>
-      <w:r>
-        <w:rPr/>
-        <w:t xml:space="preserve"> sous-</w:t>
+        <w:t>Ma sous-</w:t>
       </w:r>
       <w:bookmarkEnd w:id="28"/>
       <w:r>
@@ -2537,7 +2371,7 @@
       </w:r>
       <w:r>
         <w:rPr/>
-        <w:instrText xml:space="preserve"> XE "contenu" </w:instrText>
+        <w:instrText xml:space="preserve"> XE "contenu: : : " </w:instrText>
       </w:r>
       <w:r>
         <w:rPr/>
@@ -2545,7 +2379,6 @@
       </w:r>
       <w:r>
         <w:rPr/>
-        <w:t>contenu</w:t>
       </w:r>
       <w:r>
         <w:rPr/>
@@ -2553,7 +2386,7 @@
       </w:r>
       <w:r>
         <w:rPr/>
-        <w:t xml:space="preserve"> de ma sous partie.</w:t>
+        <w:t>contenu de ma sous partie.</w:t>
       </w:r>
       <w:r>
         <w:br w:type="page"/>
@@ -2562,6 +2395,8 @@
     <w:p>
       <w:pPr>
         <w:pStyle w:val="Heading1"/>
+        <w:spacing w:before="0" w:after="0"/>
+        <w:ind w:hanging="0" w:left="432"/>
         <w:rPr/>
       </w:pPr>
       <w:bookmarkStart w:id="29" w:name="__RefHeading___Toc1571_1922954643"/>
@@ -2579,16 +2414,12 @@
     </w:p>
     <w:p>
       <w:pPr>
-        <w:pStyle w:val="Commentaire"/>
-        <w:rPr/>
-      </w:pPr>
-      <w:r>
-        <w:rPr/>
-        <w:t xml:space="preserve">Commentaire : Ceci est un commentaire de partie, </w:t>
-      </w:r>
-      <w:r>
-        <w:rPr/>
-        <w:t>il peut servire à résumer ou contextualiser la partie à venir.</w:t>
+        <w:pStyle w:val="Commentaireuser"/>
+        <w:rPr/>
+      </w:pPr>
+      <w:r>
+        <w:rPr/>
+        <w:t>Commentaire : Ceci est un commentaire de partie, il peut servire à résumer ou contextualiser la partie à venir.</w:t>
       </w:r>
     </w:p>
     <w:p>
@@ -2606,15 +2437,7 @@
       <w:bookmarkEnd w:id="31"/>
       <w:r>
         <w:rPr/>
-        <w:t>M</w:t>
-      </w:r>
-      <w:r>
-        <w:rPr/>
-        <w:t>a</w:t>
-      </w:r>
-      <w:r>
-        <w:rPr/>
-        <w:t xml:space="preserve"> sous-</w:t>
+        <w:t>Ma sous-</w:t>
       </w:r>
       <w:bookmarkEnd w:id="32"/>
       <w:r>
@@ -2636,7 +2459,7 @@
       </w:r>
       <w:r>
         <w:rPr/>
-        <w:instrText xml:space="preserve"> XE "contenu" </w:instrText>
+        <w:instrText xml:space="preserve"> XE "contenu: : : " </w:instrText>
       </w:r>
       <w:r>
         <w:rPr/>
@@ -2644,7 +2467,6 @@
       </w:r>
       <w:r>
         <w:rPr/>
-        <w:t>contenu</w:t>
       </w:r>
       <w:r>
         <w:rPr/>
@@ -2652,7 +2474,7 @@
       </w:r>
       <w:r>
         <w:rPr/>
-        <w:t xml:space="preserve"> de ma sous partie.</w:t>
+        <w:t>contenu de ma sous partie.</w:t>
       </w:r>
     </w:p>
     <w:p>
@@ -2670,15 +2492,7 @@
       <w:bookmarkEnd w:id="33"/>
       <w:r>
         <w:rPr/>
-        <w:t>M</w:t>
-      </w:r>
-      <w:r>
-        <w:rPr/>
-        <w:t>a</w:t>
-      </w:r>
-      <w:r>
-        <w:rPr/>
-        <w:t xml:space="preserve"> sous-</w:t>
+        <w:t>Ma sous-</w:t>
       </w:r>
       <w:bookmarkEnd w:id="34"/>
       <w:r>
@@ -2700,7 +2514,7 @@
       </w:r>
       <w:r>
         <w:rPr/>
-        <w:instrText xml:space="preserve"> XE "contenu" </w:instrText>
+        <w:instrText xml:space="preserve"> XE "contenu: : : " </w:instrText>
       </w:r>
       <w:r>
         <w:rPr/>
@@ -2708,7 +2522,6 @@
       </w:r>
       <w:r>
         <w:rPr/>
-        <w:t>contenu</w:t>
       </w:r>
       <w:r>
         <w:rPr/>
@@ -2716,7 +2529,7 @@
       </w:r>
       <w:r>
         <w:rPr/>
-        <w:t xml:space="preserve"> de ma sous partie.</w:t>
+        <w:t>contenu de ma sous partie.</w:t>
       </w:r>
     </w:p>
     <w:p>
@@ -2734,15 +2547,7 @@
       <w:bookmarkEnd w:id="35"/>
       <w:r>
         <w:rPr/>
-        <w:t>M</w:t>
-      </w:r>
-      <w:r>
-        <w:rPr/>
-        <w:t>a</w:t>
-      </w:r>
-      <w:r>
-        <w:rPr/>
-        <w:t xml:space="preserve"> sous-</w:t>
+        <w:t>Ma sous-</w:t>
       </w:r>
       <w:bookmarkEnd w:id="36"/>
       <w:r>
@@ -2764,7 +2569,7 @@
       </w:r>
       <w:r>
         <w:rPr/>
-        <w:instrText xml:space="preserve"> XE "contenu" </w:instrText>
+        <w:instrText xml:space="preserve"> XE "contenu: : : " </w:instrText>
       </w:r>
       <w:r>
         <w:rPr/>
@@ -2772,7 +2577,6 @@
       </w:r>
       <w:r>
         <w:rPr/>
-        <w:t>contenu</w:t>
       </w:r>
       <w:r>
         <w:rPr/>
@@ -2780,7 +2584,7 @@
       </w:r>
       <w:r>
         <w:rPr/>
-        <w:t xml:space="preserve"> de ma sous partie.</w:t>
+        <w:t>contenu de ma sous partie.</w:t>
       </w:r>
       <w:r>
         <w:br w:type="page"/>
@@ -2839,6 +2643,8 @@
     <w:p>
       <w:pPr>
         <w:pStyle w:val="Heading1"/>
+        <w:spacing w:before="0" w:after="0"/>
+        <w:ind w:hanging="0" w:left="432"/>
         <w:rPr/>
       </w:pPr>
       <w:bookmarkStart w:id="39" w:name="__RefHeading___Toc3520_1922954643"/>
@@ -2879,7 +2685,7 @@
           </w:tcPr>
           <w:p>
             <w:pPr>
-              <w:pStyle w:val="Contenudetableau"/>
+              <w:pStyle w:val="Contenudetableauuser"/>
               <w:spacing w:before="0" w:after="160"/>
               <w:jc w:val="center"/>
               <w:rPr>
@@ -2911,7 +2717,7 @@
           </w:tcPr>
           <w:p>
             <w:pPr>
-              <w:pStyle w:val="Contenudetableau"/>
+              <w:pStyle w:val="Contenudetableauuser"/>
               <w:spacing w:before="0" w:after="160"/>
               <w:jc w:val="center"/>
               <w:rPr>
@@ -2944,7 +2750,7 @@
           </w:tcPr>
           <w:p>
             <w:pPr>
-              <w:pStyle w:val="Contenudetableau"/>
+              <w:pStyle w:val="Contenudetableauuser"/>
               <w:spacing w:before="0" w:after="160"/>
               <w:jc w:val="center"/>
               <w:rPr/>
@@ -2967,7 +2773,7 @@
           </w:tcPr>
           <w:p>
             <w:pPr>
-              <w:pStyle w:val="Contenudetableau"/>
+              <w:pStyle w:val="Contenudetableauuser"/>
               <w:spacing w:before="0" w:after="160"/>
               <w:jc w:val="center"/>
               <w:rPr/>
@@ -2992,7 +2798,7 @@
           </w:tcPr>
           <w:p>
             <w:pPr>
-              <w:pStyle w:val="Contenudetableau"/>
+              <w:pStyle w:val="Contenudetableauuser"/>
               <w:spacing w:before="0" w:after="160"/>
               <w:jc w:val="center"/>
               <w:rPr/>
@@ -3014,7 +2820,7 @@
           </w:tcPr>
           <w:p>
             <w:pPr>
-              <w:pStyle w:val="Contenudetableau"/>
+              <w:pStyle w:val="Contenudetableauuser"/>
               <w:spacing w:before="0" w:after="160"/>
               <w:jc w:val="center"/>
               <w:rPr/>
@@ -3038,7 +2844,7 @@
           </w:tcPr>
           <w:p>
             <w:pPr>
-              <w:pStyle w:val="Contenudetableau"/>
+              <w:pStyle w:val="Contenudetableauuser"/>
               <w:spacing w:before="0" w:after="160"/>
               <w:jc w:val="center"/>
               <w:rPr/>
@@ -3060,7 +2866,7 @@
           </w:tcPr>
           <w:p>
             <w:pPr>
-              <w:pStyle w:val="Contenudetableau"/>
+              <w:pStyle w:val="Contenudetableauuser"/>
               <w:spacing w:before="0" w:after="160"/>
               <w:jc w:val="center"/>
               <w:rPr/>
@@ -3084,7 +2890,7 @@
           </w:tcPr>
           <w:p>
             <w:pPr>
-              <w:pStyle w:val="Contenudetableau"/>
+              <w:pStyle w:val="Contenudetableauuser"/>
               <w:spacing w:before="0" w:after="160"/>
               <w:jc w:val="center"/>
               <w:rPr/>
@@ -3106,7 +2912,7 @@
           </w:tcPr>
           <w:p>
             <w:pPr>
-              <w:pStyle w:val="Contenudetableau"/>
+              <w:pStyle w:val="Contenudetableauuser"/>
               <w:spacing w:before="0" w:after="160"/>
               <w:jc w:val="center"/>
               <w:rPr/>
@@ -3130,7 +2936,7 @@
           </w:tcPr>
           <w:p>
             <w:pPr>
-              <w:pStyle w:val="Contenudetableau"/>
+              <w:pStyle w:val="Contenudetableauuser"/>
               <w:spacing w:before="0" w:after="160"/>
               <w:jc w:val="center"/>
               <w:rPr/>
@@ -3152,7 +2958,7 @@
           </w:tcPr>
           <w:p>
             <w:pPr>
-              <w:pStyle w:val="Contenudetableau"/>
+              <w:pStyle w:val="Contenudetableauuser"/>
               <w:spacing w:before="0" w:after="160"/>
               <w:jc w:val="center"/>
               <w:rPr/>
@@ -3176,7 +2982,7 @@
           </w:tcPr>
           <w:p>
             <w:pPr>
-              <w:pStyle w:val="Contenudetableau"/>
+              <w:pStyle w:val="Contenudetableauuser"/>
               <w:spacing w:before="0" w:after="160"/>
               <w:jc w:val="center"/>
               <w:rPr/>
@@ -3198,7 +3004,7 @@
           </w:tcPr>
           <w:p>
             <w:pPr>
-              <w:pStyle w:val="Contenudetableau"/>
+              <w:pStyle w:val="Contenudetableauuser"/>
               <w:spacing w:before="0" w:after="160"/>
               <w:jc w:val="center"/>
               <w:rPr/>
@@ -3222,7 +3028,7 @@
           </w:tcPr>
           <w:p>
             <w:pPr>
-              <w:pStyle w:val="Contenudetableau"/>
+              <w:pStyle w:val="Contenudetableauuser"/>
               <w:spacing w:before="0" w:after="160"/>
               <w:jc w:val="center"/>
               <w:rPr/>
@@ -3244,7 +3050,7 @@
           </w:tcPr>
           <w:p>
             <w:pPr>
-              <w:pStyle w:val="Contenudetableau"/>
+              <w:pStyle w:val="Contenudetableauuser"/>
               <w:spacing w:before="0" w:after="160"/>
               <w:jc w:val="center"/>
               <w:rPr/>
@@ -3268,7 +3074,7 @@
           </w:tcPr>
           <w:p>
             <w:pPr>
-              <w:pStyle w:val="Contenudetableau"/>
+              <w:pStyle w:val="Contenudetableauuser"/>
               <w:spacing w:before="0" w:after="160"/>
               <w:jc w:val="center"/>
               <w:rPr/>
@@ -3290,7 +3096,7 @@
           </w:tcPr>
           <w:p>
             <w:pPr>
-              <w:pStyle w:val="Contenudetableau"/>
+              <w:pStyle w:val="Contenudetableauuser"/>
               <w:spacing w:before="0" w:after="160"/>
               <w:jc w:val="center"/>
               <w:rPr/>
@@ -3317,6 +3123,8 @@
     <w:p>
       <w:pPr>
         <w:pStyle w:val="Heading1"/>
+        <w:spacing w:before="0" w:after="0"/>
+        <w:ind w:hanging="0" w:left="432"/>
         <w:rPr/>
       </w:pPr>
       <w:bookmarkStart w:id="40" w:name="__RefHeading___Toc1309_1922954643"/>
@@ -3334,15 +3142,17 @@
       <w:r>
         <w:rPr/>
       </w:r>
+      <w:r>
+        <w:br w:type="page"/>
+      </w:r>
     </w:p>
     <w:p>
       <w:pPr>
         <w:pStyle w:val="Heading1"/>
-        <w:rPr/>
-      </w:pPr>
-      <w:r>
-        <w:br w:type="page"/>
-      </w:r>
+        <w:spacing w:before="0" w:after="0"/>
+        <w:ind w:hanging="0" w:left="432"/>
+        <w:rPr/>
+      </w:pPr>
       <w:r>
         <w:rPr/>
         <w:t>BIBLIOGRAPHIE</w:t>
@@ -3359,8 +3169,9 @@
       </w:r>
     </w:p>
     <w:sectPr>
-      <w:footerReference w:type="default" r:id="rId6"/>
-      <w:footerReference w:type="first" r:id="rId7"/>
+      <w:footerReference w:type="even" r:id="rId7"/>
+      <w:footerReference w:type="default" r:id="rId8"/>
+      <w:footerReference w:type="first" r:id="rId9"/>
       <w:type w:val="nextPage"/>
       <w:pgSz w:w="11906" w:h="16838"/>
       <w:pgMar w:left="1417" w:right="1417" w:gutter="0" w:header="0" w:top="1417" w:footer="708" w:bottom="1417"/>
@@ -3378,72 +3189,10 @@
   <w:p>
     <w:pPr>
       <w:pStyle w:val="Footer"/>
-      <w:jc w:val="right"/>
       <w:rPr/>
     </w:pPr>
     <w:r>
       <w:rPr/>
-      <w:fldChar w:fldCharType="begin"/>
-    </w:r>
-    <w:r>
-      <w:rPr/>
-      <w:instrText xml:space="preserve"> TITLE </w:instrText>
-    </w:r>
-    <w:r>
-      <w:rPr/>
-      <w:fldChar w:fldCharType="separate"/>
-    </w:r>
-    <w:r>
-      <w:rPr/>
-    </w:r>
-    <w:r>
-      <w:rPr/>
-      <w:fldChar w:fldCharType="end"/>
-    </w:r>
-    <w:r>
-      <w:rPr/>
-      <w:fldChar w:fldCharType="begin"/>
-    </w:r>
-    <w:r>
-      <w:rPr/>
-      <w:instrText xml:space="preserve"> PAGE </w:instrText>
-    </w:r>
-    <w:r>
-      <w:rPr/>
-      <w:fldChar w:fldCharType="separate"/>
-    </w:r>
-    <w:r>
-      <w:rPr/>
-      <w:t>vii</w:t>
-    </w:r>
-    <w:r>
-      <w:rPr/>
-      <w:fldChar w:fldCharType="end"/>
-    </w:r>
-  </w:p>
-  <w:p>
-    <w:pPr>
-      <w:pStyle w:val="Footer"/>
-      <w:rPr/>
-    </w:pPr>
-    <w:r>
-      <w:rPr/>
-      <w:fldChar w:fldCharType="begin"/>
-    </w:r>
-    <w:r>
-      <w:rPr/>
-      <w:instrText xml:space="preserve"> TITLE </w:instrText>
-    </w:r>
-    <w:r>
-      <w:rPr/>
-      <w:fldChar w:fldCharType="separate"/>
-    </w:r>
-    <w:r>
-      <w:rPr/>
-    </w:r>
-    <w:r>
-      <w:rPr/>
-      <w:fldChar w:fldCharType="end"/>
     </w:r>
   </w:p>
 </w:ftr>
@@ -3459,6 +3208,42 @@
     </w:pPr>
     <w:r>
       <w:rPr/>
+      <w:fldChar w:fldCharType="begin"/>
+    </w:r>
+    <w:r>
+      <w:rPr/>
+      <w:instrText xml:space="preserve"> TITLE </w:instrText>
+    </w:r>
+    <w:r>
+      <w:rPr/>
+      <w:fldChar w:fldCharType="separate"/>
+    </w:r>
+    <w:r>
+      <w:rPr/>
+    </w:r>
+    <w:r>
+      <w:rPr/>
+      <w:fldChar w:fldCharType="end"/>
+    </w:r>
+    <w:r>
+      <w:rPr/>
+      <w:fldChar w:fldCharType="begin"/>
+    </w:r>
+    <w:r>
+      <w:rPr/>
+      <w:instrText xml:space="preserve"> PAGE </w:instrText>
+    </w:r>
+    <w:r>
+      <w:rPr/>
+      <w:fldChar w:fldCharType="separate"/>
+    </w:r>
+    <w:r>
+      <w:rPr/>
+      <w:t>vii</w:t>
+    </w:r>
+    <w:r>
+      <w:rPr/>
+      <w:fldChar w:fldCharType="end"/>
     </w:r>
   </w:p>
   <w:p>
@@ -3468,6 +3253,22 @@
     </w:pPr>
     <w:r>
       <w:rPr/>
+      <w:fldChar w:fldCharType="begin"/>
+    </w:r>
+    <w:r>
+      <w:rPr/>
+      <w:instrText xml:space="preserve"> TITLE </w:instrText>
+    </w:r>
+    <w:r>
+      <w:rPr/>
+      <w:fldChar w:fldCharType="separate"/>
+    </w:r>
+    <w:r>
+      <w:rPr/>
+    </w:r>
+    <w:r>
+      <w:rPr/>
+      <w:fldChar w:fldCharType="end"/>
     </w:r>
   </w:p>
 </w:ftr>
@@ -3483,23 +3284,6 @@
     </w:pPr>
     <w:r>
       <w:rPr/>
-      <w:fldChar w:fldCharType="begin"/>
-    </w:r>
-    <w:r>
-      <w:rPr/>
-      <w:instrText xml:space="preserve"> PAGE </w:instrText>
-    </w:r>
-    <w:r>
-      <w:rPr/>
-      <w:fldChar w:fldCharType="separate"/>
-    </w:r>
-    <w:r>
-      <w:rPr/>
-      <w:t>8</w:t>
-    </w:r>
-    <w:r>
-      <w:rPr/>
-      <w:fldChar w:fldCharType="end"/>
     </w:r>
   </w:p>
   <w:p>
@@ -3516,7 +3300,97 @@
 
 <file path=word/footer4.xml><?xml version="1.0" encoding="utf-8"?>
 <w:ftr xmlns:o="urn:schemas-microsoft-com:office:office" xmlns:r="http://schemas.openxmlformats.org/officeDocument/2006/relationships" xmlns:v="urn:schemas-microsoft-com:vml" xmlns:w="http://schemas.openxmlformats.org/wordprocessingml/2006/main" xmlns:w10="urn:schemas-microsoft-com:office:word" xmlns:wp="http://schemas.openxmlformats.org/drawingml/2006/wordprocessingDrawing" xmlns:pic="http://schemas.openxmlformats.org/drawingml/2006/picture" xmlns:wps="http://schemas.microsoft.com/office/word/2010/wordprocessingShape" xmlns:wpg="http://schemas.microsoft.com/office/word/2010/wordprocessingGroup" xmlns:mc="http://schemas.openxmlformats.org/markup-compatibility/2006" xmlns:wp14="http://schemas.microsoft.com/office/word/2010/wordprocessingDrawing" xmlns:w14="http://schemas.microsoft.com/office/word/2010/wordml" xmlns:w15="http://schemas.microsoft.com/office/word/2012/wordml" mc:Ignorable="w14 wp14 w15">
-  <w:p/>
+  <w:p>
+    <w:pPr>
+      <w:pStyle w:val="Footer"/>
+      <w:rPr/>
+    </w:pPr>
+    <w:r>
+      <w:rPr/>
+    </w:r>
+  </w:p>
+</w:ftr>
+</file>
+
+<file path=word/footer5.xml><?xml version="1.0" encoding="utf-8"?>
+<w:ftr xmlns:o="urn:schemas-microsoft-com:office:office" xmlns:r="http://schemas.openxmlformats.org/officeDocument/2006/relationships" xmlns:v="urn:schemas-microsoft-com:vml" xmlns:w="http://schemas.openxmlformats.org/wordprocessingml/2006/main" xmlns:w10="urn:schemas-microsoft-com:office:word" xmlns:wp="http://schemas.openxmlformats.org/drawingml/2006/wordprocessingDrawing" xmlns:pic="http://schemas.openxmlformats.org/drawingml/2006/picture" xmlns:wps="http://schemas.microsoft.com/office/word/2010/wordprocessingShape" xmlns:wpg="http://schemas.microsoft.com/office/word/2010/wordprocessingGroup" xmlns:mc="http://schemas.openxmlformats.org/markup-compatibility/2006" xmlns:wp14="http://schemas.microsoft.com/office/word/2010/wordprocessingDrawing" xmlns:w14="http://schemas.microsoft.com/office/word/2010/wordml" xmlns:w15="http://schemas.microsoft.com/office/word/2012/wordml" mc:Ignorable="w14 wp14 w15">
+  <w:p>
+    <w:pPr>
+      <w:pStyle w:val="Footer"/>
+      <w:jc w:val="right"/>
+      <w:rPr/>
+    </w:pPr>
+    <w:r>
+      <w:rPr/>
+      <w:fldChar w:fldCharType="begin"/>
+    </w:r>
+    <w:r>
+      <w:rPr/>
+      <w:instrText xml:space="preserve"> PAGE </w:instrText>
+    </w:r>
+    <w:r>
+      <w:rPr/>
+      <w:fldChar w:fldCharType="separate"/>
+    </w:r>
+    <w:r>
+      <w:rPr/>
+      <w:t>8</w:t>
+    </w:r>
+    <w:r>
+      <w:rPr/>
+      <w:fldChar w:fldCharType="end"/>
+    </w:r>
+  </w:p>
+  <w:p>
+    <w:pPr>
+      <w:pStyle w:val="Footer"/>
+      <w:rPr/>
+    </w:pPr>
+    <w:r>
+      <w:rPr/>
+    </w:r>
+  </w:p>
+</w:ftr>
+</file>
+
+<file path=word/footer6.xml><?xml version="1.0" encoding="utf-8"?>
+<w:ftr xmlns:o="urn:schemas-microsoft-com:office:office" xmlns:r="http://schemas.openxmlformats.org/officeDocument/2006/relationships" xmlns:v="urn:schemas-microsoft-com:vml" xmlns:w="http://schemas.openxmlformats.org/wordprocessingml/2006/main" xmlns:w10="urn:schemas-microsoft-com:office:word" xmlns:wp="http://schemas.openxmlformats.org/drawingml/2006/wordprocessingDrawing" xmlns:pic="http://schemas.openxmlformats.org/drawingml/2006/picture" xmlns:wps="http://schemas.microsoft.com/office/word/2010/wordprocessingShape" xmlns:wpg="http://schemas.microsoft.com/office/word/2010/wordprocessingGroup" xmlns:mc="http://schemas.openxmlformats.org/markup-compatibility/2006" xmlns:wp14="http://schemas.microsoft.com/office/word/2010/wordprocessingDrawing" xmlns:w14="http://schemas.microsoft.com/office/word/2010/wordml" xmlns:w15="http://schemas.microsoft.com/office/word/2012/wordml" mc:Ignorable="w14 wp14 w15">
+  <w:p>
+    <w:pPr>
+      <w:pStyle w:val="Footer"/>
+      <w:jc w:val="right"/>
+      <w:rPr/>
+    </w:pPr>
+    <w:r>
+      <w:rPr/>
+      <w:fldChar w:fldCharType="begin"/>
+    </w:r>
+    <w:r>
+      <w:rPr/>
+      <w:instrText xml:space="preserve"> PAGE </w:instrText>
+    </w:r>
+    <w:r>
+      <w:rPr/>
+      <w:fldChar w:fldCharType="separate"/>
+    </w:r>
+    <w:r>
+      <w:rPr/>
+      <w:t>8</w:t>
+    </w:r>
+    <w:r>
+      <w:rPr/>
+      <w:fldChar w:fldCharType="end"/>
+    </w:r>
+  </w:p>
+  <w:p>
+    <w:pPr>
+      <w:pStyle w:val="Footer"/>
+      <w:rPr/>
+    </w:pPr>
+    <w:r>
+      <w:rPr/>
+    </w:r>
+  </w:p>
 </w:ftr>
 </file>
 
@@ -3538,8 +3412,8 @@
     </w:lvl>
     <w:lvl w:ilvl="1">
       <w:start w:val="1"/>
+      <w:numFmt w:val="decimal"/>
       <w:pStyle w:val="Heading2"/>
-      <w:numFmt w:val="decimal"/>
       <w:lvlText w:val="%1.%2"/>
       <w:lvlJc w:val="left"/>
       <w:pPr>
@@ -3549,16 +3423,16 @@
         <w:ind w:left="576" w:hanging="576"/>
       </w:pPr>
       <w:rPr>
+        <w:b/>
+        <w:bCs/>
         <w:sz w:val="24"/>
-        <w:b/>
         <w:szCs w:val="24"/>
-        <w:bCs/>
       </w:rPr>
     </w:lvl>
     <w:lvl w:ilvl="2">
       <w:start w:val="1"/>
+      <w:numFmt w:val="decimal"/>
       <w:pStyle w:val="Heading3"/>
-      <w:numFmt w:val="decimal"/>
       <w:lvlText w:val="%1.%2.%3"/>
       <w:lvlJc w:val="left"/>
       <w:pPr>
@@ -3571,8 +3445,8 @@
     </w:lvl>
     <w:lvl w:ilvl="3">
       <w:start w:val="1"/>
+      <w:numFmt w:val="decimal"/>
       <w:pStyle w:val="Heading4"/>
-      <w:numFmt w:val="decimal"/>
       <w:lvlText w:val="%1.%2.%3.%4"/>
       <w:lvlJc w:val="left"/>
       <w:pPr>
@@ -3585,8 +3459,8 @@
     </w:lvl>
     <w:lvl w:ilvl="4">
       <w:start w:val="1"/>
+      <w:numFmt w:val="decimal"/>
       <w:pStyle w:val="Heading5"/>
-      <w:numFmt w:val="decimal"/>
       <w:lvlText w:val="%1.%2.%3.%4.%5"/>
       <w:lvlJc w:val="left"/>
       <w:pPr>
@@ -3599,8 +3473,8 @@
     </w:lvl>
     <w:lvl w:ilvl="5">
       <w:start w:val="1"/>
+      <w:numFmt w:val="decimal"/>
       <w:pStyle w:val="Heading6"/>
-      <w:numFmt w:val="decimal"/>
       <w:lvlText w:val="%1.%2.%3.%4.%5.%6"/>
       <w:lvlJc w:val="left"/>
       <w:pPr>
@@ -3613,8 +3487,8 @@
     </w:lvl>
     <w:lvl w:ilvl="6">
       <w:start w:val="1"/>
+      <w:numFmt w:val="decimal"/>
       <w:pStyle w:val="Heading7"/>
-      <w:numFmt w:val="decimal"/>
       <w:lvlText w:val="%1.%2.%3.%4.%5.%6.%7"/>
       <w:lvlJc w:val="left"/>
       <w:pPr>
@@ -3627,8 +3501,8 @@
     </w:lvl>
     <w:lvl w:ilvl="7">
       <w:start w:val="1"/>
+      <w:numFmt w:val="decimal"/>
       <w:pStyle w:val="Heading8"/>
-      <w:numFmt w:val="decimal"/>
       <w:lvlText w:val="%1.%2.%3.%4.%5.%6.%7.%8"/>
       <w:lvlJc w:val="left"/>
       <w:pPr>
@@ -3641,8 +3515,8 @@
     </w:lvl>
     <w:lvl w:ilvl="8">
       <w:start w:val="1"/>
+      <w:numFmt w:val="decimal"/>
       <w:pStyle w:val="Heading9"/>
-      <w:numFmt w:val="decimal"/>
       <w:lvlText w:val="%1.%2.%3.%4.%5.%6.%7.%8.%9"/>
       <w:lvlJc w:val="left"/>
       <w:pPr>
@@ -3681,6 +3555,7 @@
         </w:tabs>
         <w:ind w:left="1080" w:hanging="360"/>
       </w:pPr>
+      <w:rPr/>
     </w:lvl>
     <w:lvl w:ilvl="2">
       <w:start w:val="1"/>
@@ -3693,6 +3568,7 @@
         </w:tabs>
         <w:ind w:left="1440" w:hanging="360"/>
       </w:pPr>
+      <w:rPr/>
     </w:lvl>
     <w:lvl w:ilvl="3">
       <w:start w:val="1"/>
@@ -3705,6 +3581,7 @@
         </w:tabs>
         <w:ind w:left="1800" w:hanging="360"/>
       </w:pPr>
+      <w:rPr/>
     </w:lvl>
     <w:lvl w:ilvl="4">
       <w:start w:val="1"/>
@@ -3717,6 +3594,7 @@
         </w:tabs>
         <w:ind w:left="2160" w:hanging="360"/>
       </w:pPr>
+      <w:rPr/>
     </w:lvl>
     <w:lvl w:ilvl="5">
       <w:start w:val="1"/>
@@ -3729,6 +3607,7 @@
         </w:tabs>
         <w:ind w:left="2520" w:hanging="360"/>
       </w:pPr>
+      <w:rPr/>
     </w:lvl>
     <w:lvl w:ilvl="6">
       <w:start w:val="1"/>
@@ -3741,6 +3620,7 @@
         </w:tabs>
         <w:ind w:left="2880" w:hanging="360"/>
       </w:pPr>
+      <w:rPr/>
     </w:lvl>
     <w:lvl w:ilvl="7">
       <w:start w:val="1"/>
@@ -3753,6 +3633,7 @@
         </w:tabs>
         <w:ind w:left="3240" w:hanging="360"/>
       </w:pPr>
+      <w:rPr/>
     </w:lvl>
     <w:lvl w:ilvl="8">
       <w:start w:val="1"/>
@@ -3765,6 +3646,7 @@
         </w:tabs>
         <w:ind w:left="3600" w:hanging="360"/>
       </w:pPr>
+      <w:rPr/>
     </w:lvl>
   </w:abstractNum>
   <w:num w:numId="1">
@@ -3800,9 +3682,7 @@
     <w:pPr>
       <w:widowControl/>
       <w:suppressAutoHyphens w:val="true"/>
-      <w:kinsoku w:val="true"/>
-      <w:overflowPunct w:val="true"/>
-      <w:autoSpaceDE w:val="true"/>
+      <w:overflowPunct w:val="false"/>
       <w:bidi w:val="0"/>
       <w:spacing w:lineRule="auto" w:line="259" w:before="0" w:after="160"/>
       <w:jc w:val="left"/>
@@ -3856,7 +3736,7 @@
         <w:ilvl w:val="1"/>
         <w:numId w:val="1"/>
       </w:numPr>
-      <w:shd w:fill="DDDDDD" w:val="clear"/>
+      <w:shd w:val="clear" w:fill="DDDDDD"/>
       <w:spacing w:lineRule="auto" w:line="480" w:before="40" w:after="0"/>
       <w:outlineLvl w:val="1"/>
     </w:pPr>
@@ -4149,23 +4029,23 @@
       <w:u w:val="single"/>
     </w:rPr>
   </w:style>
+  <w:style w:type="character" w:styleId="Sautdindex">
+    <w:name w:val="Saut d'index"/>
+    <w:qFormat/>
+    <w:rPr/>
+  </w:style>
   <w:style w:type="character" w:styleId="Sautdindexuser">
     <w:name w:val="Saut d'index (user)"/>
     <w:qFormat/>
     <w:rPr/>
   </w:style>
-  <w:style w:type="character" w:styleId="Sautdindex">
-    <w:name w:val="Saut d'index"/>
+  <w:style w:type="character" w:styleId="Dfinitionuser">
+    <w:name w:val="Définition (user)"/>
     <w:qFormat/>
     <w:rPr/>
   </w:style>
-  <w:style w:type="character" w:styleId="Dfinition">
-    <w:name w:val="Définition"/>
-    <w:qFormat/>
-    <w:rPr/>
-  </w:style>
-  <w:style w:type="character" w:styleId="Puces">
-    <w:name w:val="Puces"/>
+  <w:style w:type="character" w:styleId="Pucesuser">
+    <w:name w:val="Puces (user)"/>
     <w:qFormat/>
     <w:rPr>
       <w:rFonts w:ascii="OpenSymbol" w:hAnsi="OpenSymbol" w:eastAsia="OpenSymbol" w:cs="OpenSymbol"/>
@@ -4181,7 +4061,7 @@
       <w:spacing w:before="240" w:after="120"/>
     </w:pPr>
     <w:rPr>
-      <w:rFonts w:ascii="Liberation Sans" w:hAnsi="Liberation Sans" w:eastAsia="Noto Sans CJK SC" w:cs="Lohit Devanagari"/>
+      <w:rFonts w:ascii="Liberation Sans" w:hAnsi="Liberation Sans" w:eastAsia="Noto Sans CJK SC" w:cs="Noto Sans Devanagari"/>
       <w:sz w:val="28"/>
       <w:szCs w:val="28"/>
     </w:rPr>
@@ -4240,14 +4120,14 @@
       <w:spacing w:before="240" w:after="120"/>
     </w:pPr>
     <w:rPr>
-      <w:rFonts w:ascii="Liberation Sans" w:hAnsi="Liberation Sans" w:eastAsia="Noto Sans CJK SC" w:cs="Noto Sans Devanagari"/>
+      <w:rFonts w:ascii="Liberation Sans" w:hAnsi="Liberation Sans" w:eastAsia="Noto Sans CJK SC" w:cs="Lohit Devanagari"/>
       <w:sz w:val="28"/>
       <w:szCs w:val="28"/>
     </w:rPr>
   </w:style>
   <w:style w:type="paragraph" w:styleId="IndexHeading">
     <w:name w:val="index heading"/>
-    <w:basedOn w:val="Titreuser"/>
+    <w:basedOn w:val="Titre"/>
     <w:pPr/>
     <w:rPr/>
   </w:style>
@@ -4272,15 +4152,15 @@
       <w:lang w:eastAsia="fr-FR"/>
     </w:rPr>
   </w:style>
+  <w:style w:type="paragraph" w:styleId="En-tteetpieddepage">
+    <w:name w:val="En-tête et pied de page"/>
+    <w:basedOn w:val="Normal"/>
+    <w:qFormat/>
+    <w:pPr/>
+    <w:rPr/>
+  </w:style>
   <w:style w:type="paragraph" w:styleId="En-tteetpieddepageuser">
     <w:name w:val="En-tête et pied de page (user)"/>
-    <w:basedOn w:val="Normal"/>
-    <w:qFormat/>
-    <w:pPr/>
-    <w:rPr/>
-  </w:style>
-  <w:style w:type="paragraph" w:styleId="En-tteetpieddepage">
-    <w:name w:val="En-tête et pied de page"/>
     <w:basedOn w:val="Normal"/>
     <w:qFormat/>
     <w:pPr/>
@@ -4408,8 +4288,8 @@
       <w:sz w:val="32"/>
     </w:rPr>
   </w:style>
-  <w:style w:type="paragraph" w:styleId="Alinangatif">
-    <w:name w:val="Alinéa négatif"/>
+  <w:style w:type="paragraph" w:styleId="Alinangatifuser">
+    <w:name w:val="Alinéa négatif (user)"/>
     <w:basedOn w:val="BodyText"/>
     <w:qFormat/>
     <w:pPr>
@@ -4429,8 +4309,8 @@
     </w:pPr>
     <w:rPr/>
   </w:style>
-  <w:style w:type="paragraph" w:styleId="Commentaire">
-    <w:name w:val="Commentaire"/>
+  <w:style w:type="paragraph" w:styleId="Commentaireuser">
+    <w:name w:val="Commentaire (user)"/>
     <w:basedOn w:val="Normal"/>
     <w:qFormat/>
     <w:pPr>
@@ -4445,8 +4325,8 @@
       <w:szCs w:val="20"/>
     </w:rPr>
   </w:style>
-  <w:style w:type="paragraph" w:styleId="Titredelindexdesfigures">
-    <w:name w:val="Titre de l'index des figures"/>
+  <w:style w:type="paragraph" w:styleId="Titredelindexdesfiguresuser">
+    <w:name w:val="Titre de l'index des figures (user)"/>
     <w:basedOn w:val="IndexHeading"/>
     <w:qFormat/>
     <w:pPr>
@@ -4460,8 +4340,8 @@
       <w:szCs w:val="32"/>
     </w:rPr>
   </w:style>
-  <w:style w:type="paragraph" w:styleId="Titredindexdetableaux">
-    <w:name w:val="Titre d'index de tableaux"/>
+  <w:style w:type="paragraph" w:styleId="Titredindexdetableauxuser">
+    <w:name w:val="Titre d'index de tableaux (user)"/>
     <w:basedOn w:val="IndexHeading"/>
     <w:qFormat/>
     <w:pPr>
@@ -4483,8 +4363,8 @@
     </w:pPr>
     <w:rPr/>
   </w:style>
-  <w:style w:type="paragraph" w:styleId="Titredindexpersonnalis">
-    <w:name w:val="Titre d'index personnalisé"/>
+  <w:style w:type="paragraph" w:styleId="Titredindexpersonnalisuser">
+    <w:name w:val="Titre d'index personnalisé (user)"/>
     <w:basedOn w:val="IndexHeading"/>
     <w:qFormat/>
     <w:pPr>
@@ -4498,8 +4378,8 @@
       <w:szCs w:val="32"/>
     </w:rPr>
   </w:style>
-  <w:style w:type="paragraph" w:styleId="Indexpersonnalis1">
-    <w:name w:val="Index personnalisé 1"/>
+  <w:style w:type="paragraph" w:styleId="Indexpersonnalis1user">
+    <w:name w:val="Index personnalisé 1 (user)"/>
     <w:basedOn w:val="Index"/>
     <w:qFormat/>
     <w:pPr>
@@ -4511,8 +4391,8 @@
     </w:pPr>
     <w:rPr/>
   </w:style>
-  <w:style w:type="paragraph" w:styleId="Contenudetableau">
-    <w:name w:val="Contenu de tableau"/>
+  <w:style w:type="paragraph" w:styleId="Contenudetableauuser">
+    <w:name w:val="Contenu de tableau (user)"/>
     <w:basedOn w:val="Normal"/>
     <w:qFormat/>
     <w:pPr>
@@ -4521,8 +4401,8 @@
     </w:pPr>
     <w:rPr/>
   </w:style>
-  <w:style w:type="paragraph" w:styleId="Contenudecadre">
-    <w:name w:val="Contenu de cadre"/>
+  <w:style w:type="paragraph" w:styleId="Contenudecadreuser">
+    <w:name w:val="Contenu de cadre (user)"/>
     <w:basedOn w:val="Normal"/>
     <w:qFormat/>
     <w:pPr/>
@@ -4535,8 +4415,8 @@
     <w:pPr/>
     <w:rPr/>
   </w:style>
-  <w:style w:type="paragraph" w:styleId="Tableau">
-    <w:name w:val="Tableau"/>
+  <w:style w:type="paragraph" w:styleId="Tableauuser">
+    <w:name w:val="Tableau (user)"/>
     <w:basedOn w:val="Caption"/>
     <w:qFormat/>
     <w:pPr/>
@@ -4554,8 +4434,8 @@
     </w:pPr>
     <w:rPr/>
   </w:style>
-  <w:style w:type="paragraph" w:styleId="Indexdetableaux1">
-    <w:name w:val="Index de tableaux 1"/>
+  <w:style w:type="paragraph" w:styleId="Indexdetableaux1user">
+    <w:name w:val="Index de tableaux 1 (user)"/>
     <w:basedOn w:val="Index"/>
     <w:qFormat/>
     <w:pPr>
@@ -4581,9 +4461,9 @@
       <w:szCs w:val="32"/>
     </w:rPr>
   </w:style>
-  <w:style w:type="paragraph" w:styleId="Titre10">
-    <w:name w:val="Titre 10"/>
-    <w:basedOn w:val="Titre"/>
+  <w:style w:type="paragraph" w:styleId="Titre10user">
+    <w:name w:val="Titre 10 (user)"/>
+    <w:basedOn w:val="Titreuser"/>
     <w:next w:val="BodyText"/>
     <w:qFormat/>
     <w:pPr>
@@ -4601,8 +4481,15 @@
       <w:szCs w:val="18"/>
     </w:rPr>
   </w:style>
-  <w:style w:type="numbering" w:styleId="Pasdelisteuser">
-    <w:name w:val="Pas de liste (user)"/>
+  <w:style w:type="paragraph" w:styleId="Contenudecadre">
+    <w:name w:val="Contenu de cadre"/>
+    <w:basedOn w:val="Normal"/>
+    <w:qFormat/>
+    <w:pPr/>
+    <w:rPr/>
+  </w:style>
+  <w:style w:type="numbering" w:styleId="Pasdeliste">
+    <w:name w:val="Pas de liste"/>
     <w:qFormat/>
   </w:style>
 </w:styles>

</xml_diff>